<commit_message>
Added Auto scaling and monitoring files
</commit_message>
<xml_diff>
--- a/Monitoring Task.docx
+++ b/Monitoring Task.docx
@@ -4242,7 +4242,17 @@
           <w:szCs w:val="18"/>
           <w:lang w:bidi="ta-IN"/>
         </w:rPr>
-        <w:t>Fi</w:t>
+        <w:t>f</w:t>
+      </w:r>
+      <w:r>
+        <w:rPr>
+          <w:rFonts w:ascii="Lucida Console" w:hAnsi="Lucida Console" w:cs="Lucida Console"/>
+          <w:kern w:val="0"/>
+          <w:sz w:val="18"/>
+          <w:szCs w:val="18"/>
+          <w:lang w:bidi="ta-IN"/>
+        </w:rPr>
+        <w:t>i</w:t>
       </w:r>
     </w:p>
     <w:p>
@@ -5708,7 +5718,14 @@
           <w:sz w:val="28"/>
           <w:szCs w:val="28"/>
         </w:rPr>
-        <w:t>Fi</w:t>
+        <w:t>f</w:t>
+      </w:r>
+      <w:r>
+        <w:rPr>
+          <w:sz w:val="28"/>
+          <w:szCs w:val="28"/>
+        </w:rPr>
+        <w:t>i</w:t>
       </w:r>
     </w:p>
     <w:p>
@@ -6222,6 +6239,7 @@
       </w:pPr>
       <w:r>
         <w:rPr>
+          <w:noProof/>
           <w:sz w:val="28"/>
           <w:szCs w:val="28"/>
         </w:rPr>
@@ -6274,6 +6292,7 @@
       </w:pPr>
       <w:r>
         <w:rPr>
+          <w:noProof/>
           <w:sz w:val="28"/>
           <w:szCs w:val="28"/>
         </w:rPr>
@@ -6327,6 +6346,7 @@
       </w:pPr>
       <w:r>
         <w:rPr>
+          <w:noProof/>
           <w:sz w:val="28"/>
           <w:szCs w:val="28"/>
         </w:rPr>
@@ -6379,6 +6399,7 @@
       </w:pPr>
       <w:r>
         <w:rPr>
+          <w:noProof/>
           <w:sz w:val="28"/>
           <w:szCs w:val="28"/>
         </w:rPr>
@@ -6431,6 +6452,7 @@
       </w:pPr>
       <w:r>
         <w:rPr>
+          <w:noProof/>
           <w:sz w:val="28"/>
           <w:szCs w:val="28"/>
         </w:rPr>
@@ -6483,6 +6505,7 @@
       </w:pPr>
       <w:r>
         <w:rPr>
+          <w:noProof/>
           <w:sz w:val="28"/>
           <w:szCs w:val="28"/>
         </w:rPr>

</xml_diff>